<commit_message>
cleaning lady coming through
</commit_message>
<xml_diff>
--- a/Opleverset_Project_5-6/Verslagen/Camera onderzoeksverslag drone.docx
+++ b/Opleverset_Project_5-6/Verslagen/Camera onderzoeksverslag drone.docx
@@ -136,6 +136,20 @@
     <w:p>
       <w:pPr>
         <w:rPr>
+          <w:lang w:val="nl-NL"/>
+        </w:rPr>
+      </w:pPr>
+    </w:p>
+    <w:p>
+      <w:pPr>
+        <w:rPr>
+          <w:lang w:val="nl-NL"/>
+        </w:rPr>
+      </w:pPr>
+    </w:p>
+    <w:p>
+      <w:pPr>
+        <w:rPr>
           <w:b/>
           <w:bCs/>
           <w:u w:val="single"/>
@@ -251,6 +265,7 @@
     </w:p>
     <w:p>
       <w:pPr>
+        <w:jc w:val="right"/>
         <w:rPr>
           <w:lang w:val="nl-NL"/>
         </w:rPr>
@@ -267,6 +282,7 @@
     </w:p>
     <w:p>
       <w:pPr>
+        <w:jc w:val="right"/>
         <w:rPr>
           <w:lang w:val="nl-NL"/>
         </w:rPr>
@@ -288,6 +304,7 @@
     </w:p>
     <w:p>
       <w:pPr>
+        <w:jc w:val="right"/>
         <w:rPr>
           <w:lang w:val="nl-NL"/>
         </w:rPr>
@@ -301,6 +318,7 @@
     </w:p>
     <w:p>
       <w:pPr>
+        <w:jc w:val="right"/>
         <w:rPr>
           <w:lang w:val="nl-NL"/>
         </w:rPr>
@@ -314,6 +332,7 @@
     </w:p>
     <w:p>
       <w:pPr>
+        <w:jc w:val="right"/>
         <w:rPr>
           <w:lang w:val="nl-NL"/>
         </w:rPr>
@@ -324,20 +343,6 @@
         </w:rPr>
         <w:t>Eerste gelegenheid</w:t>
       </w:r>
-    </w:p>
-    <w:p>
-      <w:pPr>
-        <w:rPr>
-          <w:lang w:val="nl-NL"/>
-        </w:rPr>
-      </w:pPr>
-    </w:p>
-    <w:p>
-      <w:pPr>
-        <w:rPr>
-          <w:lang w:val="nl-NL"/>
-        </w:rPr>
-      </w:pPr>
     </w:p>
     <w:sdt>
       <w:sdtPr>
@@ -365,7 +370,7 @@
       <w:sdtContent>
         <w:p>
           <w:pPr>
-            <w:pStyle w:val="TOCHeading"/>
+            <w:pStyle w:val="Kopvaninhoudsopgave"/>
           </w:pPr>
           <w:proofErr w:type="spellStart"/>
           <w:r>
@@ -375,7 +380,7 @@
         </w:p>
         <w:p>
           <w:pPr>
-            <w:pStyle w:val="TOC1"/>
+            <w:pStyle w:val="Inhopg1"/>
             <w:tabs>
               <w:tab w:val="right" w:leader="dot" w:pos="9350"/>
             </w:tabs>
@@ -386,6 +391,7 @@
               <w:i w:val="0"/>
               <w:iCs w:val="0"/>
               <w:noProof/>
+              <w:lang w:val="nl-NL" w:eastAsia="ko-KR"/>
             </w:rPr>
           </w:pPr>
           <w:r>
@@ -405,7 +411,7 @@
             </w:rPr>
             <w:fldChar w:fldCharType="separate"/>
           </w:r>
-          <w:hyperlink w:anchor="_Toc220871535" w:history="1">
+          <w:hyperlink w:anchor="_Toc220877209" w:history="1">
             <w:r>
               <w:rPr>
                 <w:rStyle w:val="Hyperlink"/>
@@ -433,7 +439,7 @@
                 <w:noProof/>
                 <w:webHidden/>
               </w:rPr>
-              <w:instrText xml:space="preserve"> PAGEREF _Toc220871535 \h </w:instrText>
+              <w:instrText xml:space="preserve"> PAGEREF _Toc220877209 \h </w:instrText>
             </w:r>
             <w:r>
               <w:rPr>
@@ -466,7 +472,7 @@
         </w:p>
         <w:p>
           <w:pPr>
-            <w:pStyle w:val="TOC1"/>
+            <w:pStyle w:val="Inhopg1"/>
             <w:tabs>
               <w:tab w:val="right" w:leader="dot" w:pos="9350"/>
             </w:tabs>
@@ -477,9 +483,10 @@
               <w:i w:val="0"/>
               <w:iCs w:val="0"/>
               <w:noProof/>
+              <w:lang w:val="nl-NL" w:eastAsia="ko-KR"/>
             </w:rPr>
           </w:pPr>
-          <w:hyperlink w:anchor="_Toc220871536" w:history="1">
+          <w:hyperlink w:anchor="_Toc220877210" w:history="1">
             <w:r>
               <w:rPr>
                 <w:rStyle w:val="Hyperlink"/>
@@ -507,7 +514,7 @@
                 <w:noProof/>
                 <w:webHidden/>
               </w:rPr>
-              <w:instrText xml:space="preserve"> PAGEREF _Toc220871536 \h </w:instrText>
+              <w:instrText xml:space="preserve"> PAGEREF _Toc220877210 \h </w:instrText>
             </w:r>
             <w:r>
               <w:rPr>
@@ -540,7 +547,7 @@
         </w:p>
         <w:p>
           <w:pPr>
-            <w:pStyle w:val="TOC1"/>
+            <w:pStyle w:val="Inhopg1"/>
             <w:tabs>
               <w:tab w:val="right" w:leader="dot" w:pos="9350"/>
             </w:tabs>
@@ -551,9 +558,10 @@
               <w:i w:val="0"/>
               <w:iCs w:val="0"/>
               <w:noProof/>
+              <w:lang w:val="nl-NL" w:eastAsia="ko-KR"/>
             </w:rPr>
           </w:pPr>
-          <w:hyperlink w:anchor="_Toc220871537" w:history="1">
+          <w:hyperlink w:anchor="_Toc220877211" w:history="1">
             <w:r>
               <w:rPr>
                 <w:rStyle w:val="Hyperlink"/>
@@ -582,7 +590,7 @@
                 <w:noProof/>
                 <w:webHidden/>
               </w:rPr>
-              <w:instrText xml:space="preserve"> PAGEREF _Toc220871537 \h </w:instrText>
+              <w:instrText xml:space="preserve"> PAGEREF _Toc220877211 \h </w:instrText>
             </w:r>
             <w:r>
               <w:rPr>
@@ -615,7 +623,7 @@
         </w:p>
         <w:p>
           <w:pPr>
-            <w:pStyle w:val="TOC1"/>
+            <w:pStyle w:val="Inhopg1"/>
             <w:tabs>
               <w:tab w:val="right" w:leader="dot" w:pos="9350"/>
             </w:tabs>
@@ -626,9 +634,10 @@
               <w:i w:val="0"/>
               <w:iCs w:val="0"/>
               <w:noProof/>
+              <w:lang w:val="nl-NL" w:eastAsia="ko-KR"/>
             </w:rPr>
           </w:pPr>
-          <w:hyperlink w:anchor="_Toc220871538" w:history="1">
+          <w:hyperlink w:anchor="_Toc220877212" w:history="1">
             <w:r>
               <w:rPr>
                 <w:rStyle w:val="Hyperlink"/>
@@ -655,7 +664,7 @@
                 <w:noProof/>
                 <w:webHidden/>
               </w:rPr>
-              <w:instrText xml:space="preserve"> PAGEREF _Toc220871538 \h </w:instrText>
+              <w:instrText xml:space="preserve"> PAGEREF _Toc220877212 \h </w:instrText>
             </w:r>
             <w:r>
               <w:rPr>
@@ -688,7 +697,7 @@
         </w:p>
         <w:p>
           <w:pPr>
-            <w:pStyle w:val="TOC1"/>
+            <w:pStyle w:val="Inhopg1"/>
             <w:tabs>
               <w:tab w:val="right" w:leader="dot" w:pos="9350"/>
             </w:tabs>
@@ -699,9 +708,10 @@
               <w:i w:val="0"/>
               <w:iCs w:val="0"/>
               <w:noProof/>
+              <w:lang w:val="nl-NL" w:eastAsia="ko-KR"/>
             </w:rPr>
           </w:pPr>
-          <w:hyperlink w:anchor="_Toc220871539" w:history="1">
+          <w:hyperlink w:anchor="_Toc220877213" w:history="1">
             <w:r>
               <w:rPr>
                 <w:rStyle w:val="Hyperlink"/>
@@ -728,7 +738,7 @@
                 <w:noProof/>
                 <w:webHidden/>
               </w:rPr>
-              <w:instrText xml:space="preserve"> PAGEREF _Toc220871539 \h </w:instrText>
+              <w:instrText xml:space="preserve"> PAGEREF _Toc220877213 \h </w:instrText>
             </w:r>
             <w:r>
               <w:rPr>
@@ -761,7 +771,7 @@
         </w:p>
         <w:p>
           <w:pPr>
-            <w:pStyle w:val="TOC1"/>
+            <w:pStyle w:val="Inhopg1"/>
             <w:tabs>
               <w:tab w:val="right" w:leader="dot" w:pos="9350"/>
             </w:tabs>
@@ -772,9 +782,10 @@
               <w:i w:val="0"/>
               <w:iCs w:val="0"/>
               <w:noProof/>
+              <w:lang w:val="nl-NL" w:eastAsia="ko-KR"/>
             </w:rPr>
           </w:pPr>
-          <w:hyperlink w:anchor="_Toc220871540" w:history="1">
+          <w:hyperlink w:anchor="_Toc220877214" w:history="1">
             <w:r>
               <w:rPr>
                 <w:rStyle w:val="Hyperlink"/>
@@ -802,7 +813,7 @@
                 <w:noProof/>
                 <w:webHidden/>
               </w:rPr>
-              <w:instrText xml:space="preserve"> PAGEREF _Toc220871540 \h </w:instrText>
+              <w:instrText xml:space="preserve"> PAGEREF _Toc220877214 \h </w:instrText>
             </w:r>
             <w:r>
               <w:rPr>
@@ -835,7 +846,7 @@
         </w:p>
         <w:p>
           <w:pPr>
-            <w:pStyle w:val="TOC2"/>
+            <w:pStyle w:val="Inhopg2"/>
             <w:tabs>
               <w:tab w:val="left" w:pos="720"/>
               <w:tab w:val="right" w:leader="dot" w:pos="9350"/>
@@ -847,9 +858,10 @@
               <w:noProof/>
               <w:sz w:val="24"/>
               <w:szCs w:val="24"/>
+              <w:lang w:val="nl-NL" w:eastAsia="ko-KR"/>
             </w:rPr>
           </w:pPr>
-          <w:hyperlink w:anchor="_Toc220871541" w:history="1">
+          <w:hyperlink w:anchor="_Toc220877215" w:history="1">
             <w:r>
               <w:rPr>
                 <w:rStyle w:val="Hyperlink"/>
@@ -866,6 +878,7 @@
                 <w:noProof/>
                 <w:sz w:val="24"/>
                 <w:szCs w:val="24"/>
+                <w:lang w:val="nl-NL" w:eastAsia="ko-KR"/>
               </w:rPr>
               <w:tab/>
             </w:r>
@@ -896,7 +909,7 @@
                 <w:noProof/>
                 <w:webHidden/>
               </w:rPr>
-              <w:instrText xml:space="preserve"> PAGEREF _Toc220871541 \h </w:instrText>
+              <w:instrText xml:space="preserve"> PAGEREF _Toc220877215 \h </w:instrText>
             </w:r>
             <w:r>
               <w:rPr>
@@ -929,7 +942,7 @@
         </w:p>
         <w:p>
           <w:pPr>
-            <w:pStyle w:val="TOC2"/>
+            <w:pStyle w:val="Inhopg2"/>
             <w:tabs>
               <w:tab w:val="left" w:pos="720"/>
               <w:tab w:val="right" w:leader="dot" w:pos="9350"/>
@@ -941,9 +954,10 @@
               <w:noProof/>
               <w:sz w:val="24"/>
               <w:szCs w:val="24"/>
+              <w:lang w:val="nl-NL" w:eastAsia="ko-KR"/>
             </w:rPr>
           </w:pPr>
-          <w:hyperlink w:anchor="_Toc220871542" w:history="1">
+          <w:hyperlink w:anchor="_Toc220877216" w:history="1">
             <w:r>
               <w:rPr>
                 <w:rStyle w:val="Hyperlink"/>
@@ -960,6 +974,7 @@
                 <w:noProof/>
                 <w:sz w:val="24"/>
                 <w:szCs w:val="24"/>
+                <w:lang w:val="nl-NL" w:eastAsia="ko-KR"/>
               </w:rPr>
               <w:tab/>
             </w:r>
@@ -990,7 +1005,7 @@
                 <w:noProof/>
                 <w:webHidden/>
               </w:rPr>
-              <w:instrText xml:space="preserve"> PAGEREF _Toc220871542 \h </w:instrText>
+              <w:instrText xml:space="preserve"> PAGEREF _Toc220877216 \h </w:instrText>
             </w:r>
             <w:r>
               <w:rPr>
@@ -1023,7 +1038,7 @@
         </w:p>
         <w:p>
           <w:pPr>
-            <w:pStyle w:val="TOC2"/>
+            <w:pStyle w:val="Inhopg2"/>
             <w:tabs>
               <w:tab w:val="left" w:pos="720"/>
               <w:tab w:val="right" w:leader="dot" w:pos="9350"/>
@@ -1035,9 +1050,10 @@
               <w:noProof/>
               <w:sz w:val="24"/>
               <w:szCs w:val="24"/>
+              <w:lang w:val="nl-NL" w:eastAsia="ko-KR"/>
             </w:rPr>
           </w:pPr>
-          <w:hyperlink w:anchor="_Toc220871543" w:history="1">
+          <w:hyperlink w:anchor="_Toc220877217" w:history="1">
             <w:r>
               <w:rPr>
                 <w:rStyle w:val="Hyperlink"/>
@@ -1054,6 +1070,7 @@
                 <w:noProof/>
                 <w:sz w:val="24"/>
                 <w:szCs w:val="24"/>
+                <w:lang w:val="nl-NL" w:eastAsia="ko-KR"/>
               </w:rPr>
               <w:tab/>
             </w:r>
@@ -1084,7 +1101,7 @@
                 <w:noProof/>
                 <w:webHidden/>
               </w:rPr>
-              <w:instrText xml:space="preserve"> PAGEREF _Toc220871543 \h </w:instrText>
+              <w:instrText xml:space="preserve"> PAGEREF _Toc220877217 \h </w:instrText>
             </w:r>
             <w:r>
               <w:rPr>
@@ -1117,7 +1134,7 @@
         </w:p>
         <w:p>
           <w:pPr>
-            <w:pStyle w:val="TOC2"/>
+            <w:pStyle w:val="Inhopg2"/>
             <w:tabs>
               <w:tab w:val="left" w:pos="720"/>
               <w:tab w:val="right" w:leader="dot" w:pos="9350"/>
@@ -1129,9 +1146,10 @@
               <w:noProof/>
               <w:sz w:val="24"/>
               <w:szCs w:val="24"/>
+              <w:lang w:val="nl-NL" w:eastAsia="ko-KR"/>
             </w:rPr>
           </w:pPr>
-          <w:hyperlink w:anchor="_Toc220871544" w:history="1">
+          <w:hyperlink w:anchor="_Toc220877218" w:history="1">
             <w:r>
               <w:rPr>
                 <w:rStyle w:val="Hyperlink"/>
@@ -1148,6 +1166,7 @@
                 <w:noProof/>
                 <w:sz w:val="24"/>
                 <w:szCs w:val="24"/>
+                <w:lang w:val="nl-NL" w:eastAsia="ko-KR"/>
               </w:rPr>
               <w:tab/>
             </w:r>
@@ -1178,7 +1197,7 @@
                 <w:noProof/>
                 <w:webHidden/>
               </w:rPr>
-              <w:instrText xml:space="preserve"> PAGEREF _Toc220871544 \h </w:instrText>
+              <w:instrText xml:space="preserve"> PAGEREF _Toc220877218 \h </w:instrText>
             </w:r>
             <w:r>
               <w:rPr>
@@ -1211,7 +1230,7 @@
         </w:p>
         <w:p>
           <w:pPr>
-            <w:pStyle w:val="TOC2"/>
+            <w:pStyle w:val="Inhopg2"/>
             <w:tabs>
               <w:tab w:val="right" w:leader="dot" w:pos="9350"/>
             </w:tabs>
@@ -1222,9 +1241,10 @@
               <w:noProof/>
               <w:sz w:val="24"/>
               <w:szCs w:val="24"/>
+              <w:lang w:val="nl-NL" w:eastAsia="ko-KR"/>
             </w:rPr>
           </w:pPr>
-          <w:hyperlink w:anchor="_Toc220871545" w:history="1">
+          <w:hyperlink w:anchor="_Toc220877219" w:history="1">
             <w:r>
               <w:rPr>
                 <w:rStyle w:val="Hyperlink"/>
@@ -1252,7 +1272,7 @@
                 <w:noProof/>
                 <w:webHidden/>
               </w:rPr>
-              <w:instrText xml:space="preserve"> PAGEREF _Toc220871545 \h </w:instrText>
+              <w:instrText xml:space="preserve"> PAGEREF _Toc220877219 \h </w:instrText>
             </w:r>
             <w:r>
               <w:rPr>
@@ -1285,7 +1305,7 @@
         </w:p>
         <w:p>
           <w:pPr>
-            <w:pStyle w:val="TOC1"/>
+            <w:pStyle w:val="Inhopg1"/>
             <w:tabs>
               <w:tab w:val="right" w:leader="dot" w:pos="9350"/>
             </w:tabs>
@@ -1296,9 +1316,10 @@
               <w:i w:val="0"/>
               <w:iCs w:val="0"/>
               <w:noProof/>
+              <w:lang w:val="nl-NL" w:eastAsia="ko-KR"/>
             </w:rPr>
           </w:pPr>
-          <w:hyperlink w:anchor="_Toc220871546" w:history="1">
+          <w:hyperlink w:anchor="_Toc220877220" w:history="1">
             <w:r>
               <w:rPr>
                 <w:rStyle w:val="Hyperlink"/>
@@ -1326,7 +1347,7 @@
                 <w:noProof/>
                 <w:webHidden/>
               </w:rPr>
-              <w:instrText xml:space="preserve"> PAGEREF _Toc220871546 \h </w:instrText>
+              <w:instrText xml:space="preserve"> PAGEREF _Toc220877220 \h </w:instrText>
             </w:r>
             <w:r>
               <w:rPr>
@@ -1359,7 +1380,7 @@
         </w:p>
         <w:p>
           <w:pPr>
-            <w:pStyle w:val="TOC1"/>
+            <w:pStyle w:val="Inhopg1"/>
             <w:tabs>
               <w:tab w:val="right" w:leader="dot" w:pos="9350"/>
             </w:tabs>
@@ -1370,9 +1391,10 @@
               <w:i w:val="0"/>
               <w:iCs w:val="0"/>
               <w:noProof/>
+              <w:lang w:val="nl-NL" w:eastAsia="ko-KR"/>
             </w:rPr>
           </w:pPr>
-          <w:hyperlink w:anchor="_Toc220871547" w:history="1">
+          <w:hyperlink w:anchor="_Toc220877221" w:history="1">
             <w:r>
               <w:rPr>
                 <w:rStyle w:val="Hyperlink"/>
@@ -1399,7 +1421,7 @@
                 <w:noProof/>
                 <w:webHidden/>
               </w:rPr>
-              <w:instrText xml:space="preserve"> PAGEREF _Toc220871547 \h </w:instrText>
+              <w:instrText xml:space="preserve"> PAGEREF _Toc220877221 \h </w:instrText>
             </w:r>
             <w:r>
               <w:rPr>
@@ -1543,14 +1565,14 @@
     </w:p>
     <w:p>
       <w:pPr>
-        <w:pStyle w:val="Heading1"/>
+        <w:pStyle w:val="Kop1"/>
         <w:rPr>
           <w:b/>
           <w:bCs/>
           <w:lang w:val="nl-NL"/>
         </w:rPr>
       </w:pPr>
-      <w:bookmarkStart w:id="0" w:name="_Toc220871535"/>
+      <w:bookmarkStart w:id="0" w:name="_Toc220877209"/>
       <w:r>
         <w:rPr>
           <w:b/>
@@ -1926,14 +1948,14 @@
     </w:p>
     <w:p>
       <w:pPr>
-        <w:pStyle w:val="Heading1"/>
+        <w:pStyle w:val="Kop1"/>
         <w:rPr>
           <w:b/>
           <w:bCs/>
           <w:lang w:val="nl-NL"/>
         </w:rPr>
       </w:pPr>
-      <w:bookmarkStart w:id="1" w:name="_Toc220871536"/>
+      <w:bookmarkStart w:id="1" w:name="_Toc220877210"/>
       <w:r>
         <w:rPr>
           <w:b/>
@@ -2291,7 +2313,7 @@
     </w:p>
     <w:p>
       <w:pPr>
-        <w:pStyle w:val="ListParagraph"/>
+        <w:pStyle w:val="Lijstalinea"/>
         <w:numPr>
           <w:ilvl w:val="0"/>
           <w:numId w:val="2"/>
@@ -2381,7 +2403,7 @@
     </w:p>
     <w:p>
       <w:pPr>
-        <w:pStyle w:val="ListParagraph"/>
+        <w:pStyle w:val="Lijstalinea"/>
         <w:numPr>
           <w:ilvl w:val="0"/>
           <w:numId w:val="2"/>
@@ -2423,7 +2445,7 @@
     </w:p>
     <w:p>
       <w:pPr>
-        <w:pStyle w:val="ListParagraph"/>
+        <w:pStyle w:val="Lijstalinea"/>
         <w:numPr>
           <w:ilvl w:val="0"/>
           <w:numId w:val="2"/>
@@ -2441,7 +2463,7 @@
     </w:p>
     <w:p>
       <w:pPr>
-        <w:pStyle w:val="ListParagraph"/>
+        <w:pStyle w:val="Lijstalinea"/>
         <w:numPr>
           <w:ilvl w:val="0"/>
           <w:numId w:val="2"/>
@@ -2607,7 +2629,7 @@
     </w:p>
     <w:p>
       <w:pPr>
-        <w:pStyle w:val="Heading1"/>
+        <w:pStyle w:val="Kop1"/>
         <w:rPr>
           <w:b/>
           <w:bCs/>
@@ -2615,7 +2637,7 @@
           <w:lang w:val="nl-NL"/>
         </w:rPr>
       </w:pPr>
-      <w:bookmarkStart w:id="2" w:name="_Toc220871537"/>
+      <w:bookmarkStart w:id="2" w:name="_Toc220877211"/>
       <w:r>
         <w:rPr>
           <w:b/>
@@ -2759,7 +2781,7 @@
     </w:p>
     <w:p>
       <w:pPr>
-        <w:pStyle w:val="ListParagraph"/>
+        <w:pStyle w:val="Lijstalinea"/>
         <w:numPr>
           <w:ilvl w:val="0"/>
           <w:numId w:val="3"/>
@@ -2801,7 +2823,7 @@
     </w:p>
     <w:p>
       <w:pPr>
-        <w:pStyle w:val="ListParagraph"/>
+        <w:pStyle w:val="Lijstalinea"/>
         <w:numPr>
           <w:ilvl w:val="0"/>
           <w:numId w:val="3"/>
@@ -2819,7 +2841,7 @@
     </w:p>
     <w:p>
       <w:pPr>
-        <w:pStyle w:val="ListParagraph"/>
+        <w:pStyle w:val="Lijstalinea"/>
         <w:numPr>
           <w:ilvl w:val="0"/>
           <w:numId w:val="3"/>
@@ -2849,7 +2871,7 @@
     </w:p>
     <w:p>
       <w:pPr>
-        <w:pStyle w:val="ListParagraph"/>
+        <w:pStyle w:val="Lijstalinea"/>
         <w:numPr>
           <w:ilvl w:val="0"/>
           <w:numId w:val="3"/>
@@ -2889,7 +2911,7 @@
     </w:p>
     <w:p>
       <w:pPr>
-        <w:pStyle w:val="ListParagraph"/>
+        <w:pStyle w:val="Lijstalinea"/>
         <w:numPr>
           <w:ilvl w:val="0"/>
           <w:numId w:val="3"/>
@@ -2913,7 +2935,7 @@
     </w:p>
     <w:p>
       <w:pPr>
-        <w:pStyle w:val="ListParagraph"/>
+        <w:pStyle w:val="Lijstalinea"/>
         <w:numPr>
           <w:ilvl w:val="0"/>
           <w:numId w:val="3"/>
@@ -2937,7 +2959,7 @@
     </w:p>
     <w:p>
       <w:pPr>
-        <w:pStyle w:val="ListParagraph"/>
+        <w:pStyle w:val="Lijstalinea"/>
         <w:numPr>
           <w:ilvl w:val="0"/>
           <w:numId w:val="3"/>
@@ -2969,7 +2991,7 @@
     </w:p>
     <w:p>
       <w:pPr>
-        <w:pStyle w:val="ListParagraph"/>
+        <w:pStyle w:val="Lijstalinea"/>
         <w:numPr>
           <w:ilvl w:val="0"/>
           <w:numId w:val="3"/>
@@ -3007,7 +3029,7 @@
     </w:p>
     <w:p>
       <w:pPr>
-        <w:pStyle w:val="ListParagraph"/>
+        <w:pStyle w:val="Lijstalinea"/>
         <w:numPr>
           <w:ilvl w:val="0"/>
           <w:numId w:val="3"/>
@@ -3025,7 +3047,7 @@
     </w:p>
     <w:p>
       <w:pPr>
-        <w:pStyle w:val="ListParagraph"/>
+        <w:pStyle w:val="Lijstalinea"/>
         <w:numPr>
           <w:ilvl w:val="0"/>
           <w:numId w:val="3"/>
@@ -3292,13 +3314,13 @@
     </w:p>
     <w:p>
       <w:pPr>
-        <w:pStyle w:val="Heading1"/>
+        <w:pStyle w:val="Kop1"/>
         <w:rPr>
           <w:b/>
           <w:bCs/>
         </w:rPr>
       </w:pPr>
-      <w:bookmarkStart w:id="3" w:name="_Toc220871538"/>
+      <w:bookmarkStart w:id="3" w:name="_Toc220877212"/>
       <w:r>
         <w:rPr>
           <w:b/>
@@ -3329,21 +3351,12 @@
           <w:iCs/>
         </w:rPr>
       </w:pPr>
-      <w:proofErr w:type="spellStart"/>
       <w:r>
         <w:rPr>
           <w:i/>
           <w:iCs/>
         </w:rPr>
-        <w:t>Arducam</w:t>
-      </w:r>
-      <w:proofErr w:type="spellEnd"/>
-      <w:r>
-        <w:rPr>
-          <w:i/>
-          <w:iCs/>
-        </w:rPr>
-        <w:t xml:space="preserve"> 4K 8MP IMX219 Autofocus USB Camera Module with Metal Housing</w:t>
+        <w:t>Arducam 4K 8MP IMX219 Autofocus USB Camera Module with Metal Housing</w:t>
       </w:r>
     </w:p>
     <w:p>
@@ -3390,7 +3403,7 @@
     </w:p>
     <w:p>
       <w:pPr>
-        <w:pStyle w:val="ListParagraph"/>
+        <w:pStyle w:val="Lijstalinea"/>
         <w:numPr>
           <w:ilvl w:val="0"/>
           <w:numId w:val="3"/>
@@ -3426,7 +3439,7 @@
     </w:p>
     <w:p>
       <w:pPr>
-        <w:pStyle w:val="ListParagraph"/>
+        <w:pStyle w:val="Lijstalinea"/>
         <w:numPr>
           <w:ilvl w:val="0"/>
           <w:numId w:val="3"/>
@@ -3456,7 +3469,7 @@
     </w:p>
     <w:p>
       <w:pPr>
-        <w:pStyle w:val="ListParagraph"/>
+        <w:pStyle w:val="Lijstalinea"/>
         <w:numPr>
           <w:ilvl w:val="0"/>
           <w:numId w:val="3"/>
@@ -3504,7 +3517,7 @@
     </w:p>
     <w:p>
       <w:pPr>
-        <w:pStyle w:val="ListParagraph"/>
+        <w:pStyle w:val="Lijstalinea"/>
         <w:numPr>
           <w:ilvl w:val="0"/>
           <w:numId w:val="3"/>
@@ -3538,7 +3551,7 @@
     </w:p>
     <w:p>
       <w:pPr>
-        <w:pStyle w:val="ListParagraph"/>
+        <w:pStyle w:val="Lijstalinea"/>
         <w:numPr>
           <w:ilvl w:val="0"/>
           <w:numId w:val="3"/>
@@ -3556,7 +3569,7 @@
     </w:p>
     <w:p>
       <w:pPr>
-        <w:pStyle w:val="ListParagraph"/>
+        <w:pStyle w:val="Lijstalinea"/>
         <w:numPr>
           <w:ilvl w:val="0"/>
           <w:numId w:val="3"/>
@@ -3586,7 +3599,7 @@
     </w:p>
     <w:p>
       <w:pPr>
-        <w:pStyle w:val="ListParagraph"/>
+        <w:pStyle w:val="Lijstalinea"/>
         <w:numPr>
           <w:ilvl w:val="0"/>
           <w:numId w:val="3"/>
@@ -3612,7 +3625,7 @@
     </w:p>
     <w:p>
       <w:pPr>
-        <w:pStyle w:val="ListParagraph"/>
+        <w:pStyle w:val="Lijstalinea"/>
         <w:numPr>
           <w:ilvl w:val="0"/>
           <w:numId w:val="3"/>
@@ -3666,7 +3679,7 @@
     </w:p>
     <w:p>
       <w:pPr>
-        <w:pStyle w:val="ListParagraph"/>
+        <w:pStyle w:val="Lijstalinea"/>
         <w:numPr>
           <w:ilvl w:val="0"/>
           <w:numId w:val="3"/>
@@ -4034,13 +4047,13 @@
     </w:p>
     <w:p>
       <w:pPr>
-        <w:pStyle w:val="Heading1"/>
+        <w:pStyle w:val="Kop1"/>
         <w:rPr>
           <w:b/>
           <w:bCs/>
         </w:rPr>
       </w:pPr>
-      <w:bookmarkStart w:id="4" w:name="_Toc220871539"/>
+      <w:bookmarkStart w:id="4" w:name="_Toc220877213"/>
       <w:r>
         <w:rPr>
           <w:b/>
@@ -4132,7 +4145,7 @@
     </w:p>
     <w:p>
       <w:pPr>
-        <w:pStyle w:val="ListParagraph"/>
+        <w:pStyle w:val="Lijstalinea"/>
         <w:numPr>
           <w:ilvl w:val="0"/>
           <w:numId w:val="3"/>
@@ -4162,7 +4175,7 @@
     </w:p>
     <w:p>
       <w:pPr>
-        <w:pStyle w:val="ListParagraph"/>
+        <w:pStyle w:val="Lijstalinea"/>
         <w:numPr>
           <w:ilvl w:val="0"/>
           <w:numId w:val="3"/>
@@ -4192,7 +4205,7 @@
     </w:p>
     <w:p>
       <w:pPr>
-        <w:pStyle w:val="ListParagraph"/>
+        <w:pStyle w:val="Lijstalinea"/>
         <w:numPr>
           <w:ilvl w:val="0"/>
           <w:numId w:val="3"/>
@@ -4246,7 +4259,7 @@
     </w:p>
     <w:p>
       <w:pPr>
-        <w:pStyle w:val="ListParagraph"/>
+        <w:pStyle w:val="Lijstalinea"/>
         <w:numPr>
           <w:ilvl w:val="0"/>
           <w:numId w:val="3"/>
@@ -4280,7 +4293,7 @@
     </w:p>
     <w:p>
       <w:pPr>
-        <w:pStyle w:val="ListParagraph"/>
+        <w:pStyle w:val="Lijstalinea"/>
         <w:numPr>
           <w:ilvl w:val="0"/>
           <w:numId w:val="3"/>
@@ -4304,7 +4317,7 @@
     </w:p>
     <w:p>
       <w:pPr>
-        <w:pStyle w:val="ListParagraph"/>
+        <w:pStyle w:val="Lijstalinea"/>
         <w:numPr>
           <w:ilvl w:val="0"/>
           <w:numId w:val="3"/>
@@ -4334,7 +4347,7 @@
     </w:p>
     <w:p>
       <w:pPr>
-        <w:pStyle w:val="ListParagraph"/>
+        <w:pStyle w:val="Lijstalinea"/>
         <w:numPr>
           <w:ilvl w:val="0"/>
           <w:numId w:val="3"/>
@@ -4358,7 +4371,7 @@
     </w:p>
     <w:p>
       <w:pPr>
-        <w:pStyle w:val="ListParagraph"/>
+        <w:pStyle w:val="Lijstalinea"/>
         <w:numPr>
           <w:ilvl w:val="0"/>
           <w:numId w:val="3"/>
@@ -4873,14 +4886,14 @@
     </w:p>
     <w:p>
       <w:pPr>
-        <w:pStyle w:val="Heading1"/>
+        <w:pStyle w:val="Kop1"/>
         <w:rPr>
           <w:b/>
           <w:bCs/>
           <w:lang w:val="nl-NL"/>
         </w:rPr>
       </w:pPr>
-      <w:bookmarkStart w:id="5" w:name="_Toc220871540"/>
+      <w:bookmarkStart w:id="5" w:name="_Toc220877214"/>
       <w:r>
         <w:rPr>
           <w:b/>
@@ -4969,7 +4982,7 @@
     </w:p>
     <w:p>
       <w:pPr>
-        <w:pStyle w:val="Heading2"/>
+        <w:pStyle w:val="Kop2"/>
         <w:numPr>
           <w:ilvl w:val="0"/>
           <w:numId w:val="8"/>
@@ -4978,7 +4991,7 @@
           <w:lang w:val="nl-NL"/>
         </w:rPr>
       </w:pPr>
-      <w:bookmarkStart w:id="6" w:name="_Toc220871541"/>
+      <w:bookmarkStart w:id="6" w:name="_Toc220877215"/>
       <w:r>
         <w:rPr>
           <w:lang w:val="nl-NL"/>
@@ -5003,7 +5016,7 @@
     </w:p>
     <w:p>
       <w:pPr>
-        <w:pStyle w:val="Heading2"/>
+        <w:pStyle w:val="Kop2"/>
         <w:numPr>
           <w:ilvl w:val="0"/>
           <w:numId w:val="8"/>
@@ -5012,7 +5025,7 @@
           <w:lang w:val="nl-NL"/>
         </w:rPr>
       </w:pPr>
-      <w:bookmarkStart w:id="7" w:name="_Toc220871542"/>
+      <w:bookmarkStart w:id="7" w:name="_Toc220877216"/>
       <w:r>
         <w:rPr>
           <w:lang w:val="nl-NL"/>
@@ -5055,7 +5068,7 @@
     </w:p>
     <w:p>
       <w:pPr>
-        <w:pStyle w:val="Heading2"/>
+        <w:pStyle w:val="Kop2"/>
         <w:numPr>
           <w:ilvl w:val="0"/>
           <w:numId w:val="8"/>
@@ -5064,7 +5077,7 @@
           <w:lang w:val="nl-NL"/>
         </w:rPr>
       </w:pPr>
-      <w:bookmarkStart w:id="8" w:name="_Toc220871543"/>
+      <w:bookmarkStart w:id="8" w:name="_Toc220877217"/>
       <w:r>
         <w:rPr>
           <w:lang w:val="nl-NL"/>
@@ -5103,7 +5116,7 @@
     </w:p>
     <w:p>
       <w:pPr>
-        <w:pStyle w:val="Heading2"/>
+        <w:pStyle w:val="Kop2"/>
         <w:numPr>
           <w:ilvl w:val="0"/>
           <w:numId w:val="8"/>
@@ -5112,7 +5125,7 @@
           <w:lang w:val="nl-NL"/>
         </w:rPr>
       </w:pPr>
-      <w:bookmarkStart w:id="9" w:name="_Toc220871544"/>
+      <w:bookmarkStart w:id="9" w:name="_Toc220877218"/>
       <w:r>
         <w:rPr>
           <w:lang w:val="nl-NL"/>
@@ -5179,7 +5192,7 @@
     </w:p>
     <w:p>
       <w:pPr>
-        <w:pStyle w:val="Heading2"/>
+        <w:pStyle w:val="Kop2"/>
         <w:ind w:firstLine="360"/>
         <w:rPr>
           <w:b/>
@@ -5187,7 +5200,7 @@
           <w:lang w:val="nl-NL"/>
         </w:rPr>
       </w:pPr>
-      <w:bookmarkStart w:id="10" w:name="_Toc220871545"/>
+      <w:bookmarkStart w:id="10" w:name="_Toc220877219"/>
       <w:r>
         <w:rPr>
           <w:b/>
@@ -5338,14 +5351,14 @@
     </w:p>
     <w:p>
       <w:pPr>
-        <w:pStyle w:val="Heading1"/>
+        <w:pStyle w:val="Kop1"/>
         <w:rPr>
           <w:b/>
           <w:bCs/>
           <w:lang w:val="nl-NL"/>
         </w:rPr>
       </w:pPr>
-      <w:bookmarkStart w:id="11" w:name="_Toc220871546"/>
+      <w:bookmarkStart w:id="11" w:name="_Toc220877220"/>
       <w:r>
         <w:rPr>
           <w:b/>
@@ -5359,7 +5372,7 @@
     <w:p/>
     <w:p>
       <w:pPr>
-        <w:pStyle w:val="ListParagraph"/>
+        <w:pStyle w:val="Lijstalinea"/>
         <w:numPr>
           <w:ilvl w:val="0"/>
           <w:numId w:val="2"/>
@@ -5417,27 +5430,19 @@
     </w:p>
     <w:p>
       <w:pPr>
-        <w:pStyle w:val="ListParagraph"/>
-      </w:pPr>
-    </w:p>
-    <w:p>
-      <w:pPr>
-        <w:pStyle w:val="ListParagraph"/>
+        <w:pStyle w:val="Lijstalinea"/>
+      </w:pPr>
+    </w:p>
+    <w:p>
+      <w:pPr>
+        <w:pStyle w:val="Lijstalinea"/>
         <w:numPr>
           <w:ilvl w:val="0"/>
           <w:numId w:val="2"/>
         </w:numPr>
       </w:pPr>
       <w:r>
-        <w:t>[2] “</w:t>
-      </w:r>
-      <w:proofErr w:type="spellStart"/>
-      <w:r>
-        <w:t>Arducam</w:t>
-      </w:r>
-      <w:proofErr w:type="spellEnd"/>
-      <w:r>
-        <w:t xml:space="preserve"> Autofocus USB Camera Module with Microphones for Computer / Raspberry Pi,” Amazon.nl. [Online]. Available:</w:t>
+        <w:t>[2] “Arducam Autofocus USB Camera Module with Microphones for Computer / Raspberry Pi,” Amazon.nl. [Online]. Available:</w:t>
       </w:r>
       <w:r>
         <w:t xml:space="preserve"> </w:t>
@@ -5459,12 +5464,12 @@
     </w:p>
     <w:p>
       <w:pPr>
-        <w:pStyle w:val="ListParagraph"/>
-      </w:pPr>
-    </w:p>
-    <w:p>
-      <w:pPr>
-        <w:pStyle w:val="ListParagraph"/>
+        <w:pStyle w:val="Lijstalinea"/>
+      </w:pPr>
+    </w:p>
+    <w:p>
+      <w:pPr>
+        <w:pStyle w:val="Lijstalinea"/>
         <w:numPr>
           <w:ilvl w:val="0"/>
           <w:numId w:val="2"/>
@@ -5499,13 +5504,13 @@
     <w:p/>
     <w:p>
       <w:pPr>
-        <w:pStyle w:val="Heading1"/>
+        <w:pStyle w:val="Kop1"/>
         <w:rPr>
           <w:b/>
           <w:bCs/>
         </w:rPr>
       </w:pPr>
-      <w:bookmarkStart w:id="12" w:name="_Toc220871547"/>
+      <w:bookmarkStart w:id="12" w:name="_Toc220877221"/>
       <w:r>
         <w:rPr>
           <w:b/>
@@ -5517,7 +5522,7 @@
     </w:p>
     <w:tbl>
       <w:tblPr>
-        <w:tblStyle w:val="TableGrid"/>
+        <w:tblStyle w:val="Tabelraster"/>
         <w:tblW w:w="0" w:type="auto"/>
         <w:tblLook w:val="04A0" w:firstRow="1" w:lastRow="0" w:firstColumn="1" w:lastColumn="0" w:noHBand="0" w:noVBand="1"/>
       </w:tblPr>
@@ -5642,21 +5647,7 @@
               <w:rPr>
                 <w:lang w:val="nl-NL"/>
               </w:rPr>
-              <w:t xml:space="preserve"> in </w:t>
-            </w:r>
-            <w:proofErr w:type="gramStart"/>
-            <w:r>
-              <w:rPr>
-                <w:lang w:val="nl-NL"/>
-              </w:rPr>
-              <w:t>het structuur</w:t>
-            </w:r>
-            <w:proofErr w:type="gramEnd"/>
-            <w:r>
-              <w:rPr>
-                <w:lang w:val="nl-NL"/>
-              </w:rPr>
-              <w:t xml:space="preserve"> van het</w:t>
+              <w:t xml:space="preserve"> in het structuur van het</w:t>
             </w:r>
             <w:r>
               <w:rPr>
@@ -5741,7 +5732,7 @@
   <w:sdt>
     <w:sdtPr>
       <w:rPr>
-        <w:rStyle w:val="PageNumber"/>
+        <w:rStyle w:val="Paginanummer"/>
       </w:rPr>
       <w:id w:val="363946337"/>
       <w:docPartObj>
@@ -5749,36 +5740,41 @@
         <w:docPartUnique/>
       </w:docPartObj>
     </w:sdtPr>
+    <w:sdtEndPr>
+      <w:rPr>
+        <w:rStyle w:val="Paginanummer"/>
+      </w:rPr>
+    </w:sdtEndPr>
     <w:sdtContent>
       <w:p>
         <w:pPr>
-          <w:pStyle w:val="Footer"/>
+          <w:pStyle w:val="Voettekst"/>
           <w:framePr w:wrap="none" w:vAnchor="text" w:hAnchor="margin" w:xAlign="right" w:y="1"/>
           <w:rPr>
-            <w:rStyle w:val="PageNumber"/>
+            <w:rStyle w:val="Paginanummer"/>
           </w:rPr>
         </w:pPr>
         <w:r>
           <w:rPr>
-            <w:rStyle w:val="PageNumber"/>
+            <w:rStyle w:val="Paginanummer"/>
           </w:rPr>
           <w:fldChar w:fldCharType="begin"/>
         </w:r>
         <w:r>
           <w:rPr>
-            <w:rStyle w:val="PageNumber"/>
+            <w:rStyle w:val="Paginanummer"/>
           </w:rPr>
           <w:instrText xml:space="preserve"> PAGE </w:instrText>
         </w:r>
         <w:r>
           <w:rPr>
-            <w:rStyle w:val="PageNumber"/>
+            <w:rStyle w:val="Paginanummer"/>
           </w:rPr>
           <w:fldChar w:fldCharType="separate"/>
         </w:r>
         <w:r>
           <w:rPr>
-            <w:rStyle w:val="PageNumber"/>
+            <w:rStyle w:val="Paginanummer"/>
           </w:rPr>
           <w:fldChar w:fldCharType="end"/>
         </w:r>
@@ -5787,7 +5783,7 @@
   </w:sdt>
   <w:p>
     <w:pPr>
-      <w:pStyle w:val="Footer"/>
+      <w:pStyle w:val="Voettekst"/>
       <w:ind w:right="360"/>
     </w:pPr>
   </w:p>
@@ -5799,7 +5795,7 @@
   <w:sdt>
     <w:sdtPr>
       <w:rPr>
-        <w:rStyle w:val="PageNumber"/>
+        <w:rStyle w:val="Paginanummer"/>
       </w:rPr>
       <w:id w:val="-941525666"/>
       <w:docPartObj>
@@ -5807,43 +5803,48 @@
         <w:docPartUnique/>
       </w:docPartObj>
     </w:sdtPr>
+    <w:sdtEndPr>
+      <w:rPr>
+        <w:rStyle w:val="Paginanummer"/>
+      </w:rPr>
+    </w:sdtEndPr>
     <w:sdtContent>
       <w:p>
         <w:pPr>
-          <w:pStyle w:val="Footer"/>
+          <w:pStyle w:val="Voettekst"/>
           <w:framePr w:wrap="none" w:vAnchor="text" w:hAnchor="margin" w:xAlign="right" w:y="1"/>
           <w:rPr>
-            <w:rStyle w:val="PageNumber"/>
+            <w:rStyle w:val="Paginanummer"/>
           </w:rPr>
         </w:pPr>
         <w:r>
           <w:rPr>
-            <w:rStyle w:val="PageNumber"/>
+            <w:rStyle w:val="Paginanummer"/>
           </w:rPr>
           <w:fldChar w:fldCharType="begin"/>
         </w:r>
         <w:r>
           <w:rPr>
-            <w:rStyle w:val="PageNumber"/>
+            <w:rStyle w:val="Paginanummer"/>
           </w:rPr>
           <w:instrText xml:space="preserve"> PAGE </w:instrText>
         </w:r>
         <w:r>
           <w:rPr>
-            <w:rStyle w:val="PageNumber"/>
+            <w:rStyle w:val="Paginanummer"/>
           </w:rPr>
           <w:fldChar w:fldCharType="separate"/>
         </w:r>
         <w:r>
           <w:rPr>
-            <w:rStyle w:val="PageNumber"/>
+            <w:rStyle w:val="Paginanummer"/>
             <w:noProof/>
           </w:rPr>
           <w:t>1</w:t>
         </w:r>
         <w:r>
           <w:rPr>
-            <w:rStyle w:val="PageNumber"/>
+            <w:rStyle w:val="Paginanummer"/>
           </w:rPr>
           <w:fldChar w:fldCharType="end"/>
         </w:r>
@@ -5852,7 +5853,7 @@
   </w:sdt>
   <w:p>
     <w:pPr>
-      <w:pStyle w:val="Footer"/>
+      <w:pStyle w:val="Voettekst"/>
       <w:ind w:right="360"/>
     </w:pPr>
   </w:p>
@@ -7236,15 +7237,15 @@
     <w:lsdException w:name="Unresolved Mention" w:semiHidden="1" w:unhideWhenUsed="1"/>
     <w:lsdException w:name="Smart Link" w:semiHidden="1" w:unhideWhenUsed="1"/>
   </w:latentStyles>
-  <w:style w:type="paragraph" w:default="1" w:styleId="Normal">
+  <w:style w:type="paragraph" w:default="1" w:styleId="Standaard">
     <w:name w:val="Normal"/>
     <w:qFormat/>
   </w:style>
-  <w:style w:type="paragraph" w:styleId="Heading1">
+  <w:style w:type="paragraph" w:styleId="Kop1">
     <w:name w:val="heading 1"/>
-    <w:basedOn w:val="Normal"/>
-    <w:next w:val="Normal"/>
-    <w:link w:val="Heading1Char"/>
+    <w:basedOn w:val="Standaard"/>
+    <w:next w:val="Standaard"/>
+    <w:link w:val="Kop1Char"/>
     <w:uiPriority w:val="9"/>
     <w:qFormat/>
     <w:rsid w:val="006C6B48"/>
@@ -7261,11 +7262,11 @@
       <w:szCs w:val="40"/>
     </w:rPr>
   </w:style>
-  <w:style w:type="paragraph" w:styleId="Heading2">
+  <w:style w:type="paragraph" w:styleId="Kop2">
     <w:name w:val="heading 2"/>
-    <w:basedOn w:val="Normal"/>
-    <w:next w:val="Normal"/>
-    <w:link w:val="Heading2Char"/>
+    <w:basedOn w:val="Standaard"/>
+    <w:next w:val="Standaard"/>
+    <w:link w:val="Kop2Char"/>
     <w:uiPriority w:val="9"/>
     <w:unhideWhenUsed/>
     <w:qFormat/>
@@ -7283,11 +7284,11 @@
       <w:szCs w:val="32"/>
     </w:rPr>
   </w:style>
-  <w:style w:type="paragraph" w:styleId="Heading3">
+  <w:style w:type="paragraph" w:styleId="Kop3">
     <w:name w:val="heading 3"/>
-    <w:basedOn w:val="Normal"/>
-    <w:next w:val="Normal"/>
-    <w:link w:val="Heading3Char"/>
+    <w:basedOn w:val="Standaard"/>
+    <w:next w:val="Standaard"/>
+    <w:link w:val="Kop3Char"/>
     <w:uiPriority w:val="9"/>
     <w:semiHidden/>
     <w:unhideWhenUsed/>
@@ -7306,11 +7307,11 @@
       <w:szCs w:val="28"/>
     </w:rPr>
   </w:style>
-  <w:style w:type="paragraph" w:styleId="Heading4">
+  <w:style w:type="paragraph" w:styleId="Kop4">
     <w:name w:val="heading 4"/>
-    <w:basedOn w:val="Normal"/>
-    <w:next w:val="Normal"/>
-    <w:link w:val="Heading4Char"/>
+    <w:basedOn w:val="Standaard"/>
+    <w:next w:val="Standaard"/>
+    <w:link w:val="Kop4Char"/>
     <w:uiPriority w:val="9"/>
     <w:semiHidden/>
     <w:unhideWhenUsed/>
@@ -7329,11 +7330,11 @@
       <w:color w:val="0F4761" w:themeColor="accent1" w:themeShade="BF"/>
     </w:rPr>
   </w:style>
-  <w:style w:type="paragraph" w:styleId="Heading5">
+  <w:style w:type="paragraph" w:styleId="Kop5">
     <w:name w:val="heading 5"/>
-    <w:basedOn w:val="Normal"/>
-    <w:next w:val="Normal"/>
-    <w:link w:val="Heading5Char"/>
+    <w:basedOn w:val="Standaard"/>
+    <w:next w:val="Standaard"/>
+    <w:link w:val="Kop5Char"/>
     <w:uiPriority w:val="9"/>
     <w:semiHidden/>
     <w:unhideWhenUsed/>
@@ -7350,11 +7351,11 @@
       <w:color w:val="0F4761" w:themeColor="accent1" w:themeShade="BF"/>
     </w:rPr>
   </w:style>
-  <w:style w:type="paragraph" w:styleId="Heading6">
+  <w:style w:type="paragraph" w:styleId="Kop6">
     <w:name w:val="heading 6"/>
-    <w:basedOn w:val="Normal"/>
-    <w:next w:val="Normal"/>
-    <w:link w:val="Heading6Char"/>
+    <w:basedOn w:val="Standaard"/>
+    <w:next w:val="Standaard"/>
+    <w:link w:val="Kop6Char"/>
     <w:uiPriority w:val="9"/>
     <w:semiHidden/>
     <w:unhideWhenUsed/>
@@ -7373,11 +7374,11 @@
       <w:color w:val="595959" w:themeColor="text1" w:themeTint="A6"/>
     </w:rPr>
   </w:style>
-  <w:style w:type="paragraph" w:styleId="Heading7">
+  <w:style w:type="paragraph" w:styleId="Kop7">
     <w:name w:val="heading 7"/>
-    <w:basedOn w:val="Normal"/>
-    <w:next w:val="Normal"/>
-    <w:link w:val="Heading7Char"/>
+    <w:basedOn w:val="Standaard"/>
+    <w:next w:val="Standaard"/>
+    <w:link w:val="Kop7Char"/>
     <w:uiPriority w:val="9"/>
     <w:semiHidden/>
     <w:unhideWhenUsed/>
@@ -7394,11 +7395,11 @@
       <w:color w:val="595959" w:themeColor="text1" w:themeTint="A6"/>
     </w:rPr>
   </w:style>
-  <w:style w:type="paragraph" w:styleId="Heading8">
+  <w:style w:type="paragraph" w:styleId="Kop8">
     <w:name w:val="heading 8"/>
-    <w:basedOn w:val="Normal"/>
-    <w:next w:val="Normal"/>
-    <w:link w:val="Heading8Char"/>
+    <w:basedOn w:val="Standaard"/>
+    <w:next w:val="Standaard"/>
+    <w:link w:val="Kop8Char"/>
     <w:uiPriority w:val="9"/>
     <w:semiHidden/>
     <w:unhideWhenUsed/>
@@ -7417,11 +7418,11 @@
       <w:color w:val="272727" w:themeColor="text1" w:themeTint="D8"/>
     </w:rPr>
   </w:style>
-  <w:style w:type="paragraph" w:styleId="Heading9">
+  <w:style w:type="paragraph" w:styleId="Kop9">
     <w:name w:val="heading 9"/>
-    <w:basedOn w:val="Normal"/>
-    <w:next w:val="Normal"/>
-    <w:link w:val="Heading9Char"/>
+    <w:basedOn w:val="Standaard"/>
+    <w:next w:val="Standaard"/>
+    <w:link w:val="Kop9Char"/>
     <w:uiPriority w:val="9"/>
     <w:semiHidden/>
     <w:unhideWhenUsed/>
@@ -7438,13 +7439,13 @@
       <w:color w:val="272727" w:themeColor="text1" w:themeTint="D8"/>
     </w:rPr>
   </w:style>
-  <w:style w:type="character" w:default="1" w:styleId="DefaultParagraphFont">
+  <w:style w:type="character" w:default="1" w:styleId="Standaardalinea-lettertype">
     <w:name w:val="Default Paragraph Font"/>
     <w:uiPriority w:val="1"/>
     <w:semiHidden/>
     <w:unhideWhenUsed/>
   </w:style>
-  <w:style w:type="table" w:default="1" w:styleId="TableNormal">
+  <w:style w:type="table" w:default="1" w:styleId="Standaardtabel">
     <w:name w:val="Normal Table"/>
     <w:uiPriority w:val="99"/>
     <w:semiHidden/>
@@ -7459,16 +7460,16 @@
       </w:tblCellMar>
     </w:tblPr>
   </w:style>
-  <w:style w:type="numbering" w:default="1" w:styleId="NoList">
+  <w:style w:type="numbering" w:default="1" w:styleId="Geenlijst">
     <w:name w:val="No List"/>
     <w:uiPriority w:val="99"/>
     <w:semiHidden/>
     <w:unhideWhenUsed/>
   </w:style>
-  <w:style w:type="character" w:customStyle="1" w:styleId="Heading1Char">
-    <w:name w:val="Heading 1 Char"/>
-    <w:basedOn w:val="DefaultParagraphFont"/>
-    <w:link w:val="Heading1"/>
+  <w:style w:type="character" w:customStyle="1" w:styleId="Kop1Char">
+    <w:name w:val="Kop 1 Char"/>
+    <w:basedOn w:val="Standaardalinea-lettertype"/>
+    <w:link w:val="Kop1"/>
     <w:uiPriority w:val="9"/>
     <w:rsid w:val="006C6B48"/>
     <w:rPr>
@@ -7478,10 +7479,10 @@
       <w:szCs w:val="40"/>
     </w:rPr>
   </w:style>
-  <w:style w:type="character" w:customStyle="1" w:styleId="Heading2Char">
-    <w:name w:val="Heading 2 Char"/>
-    <w:basedOn w:val="DefaultParagraphFont"/>
-    <w:link w:val="Heading2"/>
+  <w:style w:type="character" w:customStyle="1" w:styleId="Kop2Char">
+    <w:name w:val="Kop 2 Char"/>
+    <w:basedOn w:val="Standaardalinea-lettertype"/>
+    <w:link w:val="Kop2"/>
     <w:uiPriority w:val="9"/>
     <w:rsid w:val="006C6B48"/>
     <w:rPr>
@@ -7491,10 +7492,10 @@
       <w:szCs w:val="32"/>
     </w:rPr>
   </w:style>
-  <w:style w:type="character" w:customStyle="1" w:styleId="Heading3Char">
-    <w:name w:val="Heading 3 Char"/>
-    <w:basedOn w:val="DefaultParagraphFont"/>
-    <w:link w:val="Heading3"/>
+  <w:style w:type="character" w:customStyle="1" w:styleId="Kop3Char">
+    <w:name w:val="Kop 3 Char"/>
+    <w:basedOn w:val="Standaardalinea-lettertype"/>
+    <w:link w:val="Kop3"/>
     <w:uiPriority w:val="9"/>
     <w:semiHidden/>
     <w:rsid w:val="006C6B48"/>
@@ -7505,10 +7506,10 @@
       <w:szCs w:val="28"/>
     </w:rPr>
   </w:style>
-  <w:style w:type="character" w:customStyle="1" w:styleId="Heading4Char">
-    <w:name w:val="Heading 4 Char"/>
-    <w:basedOn w:val="DefaultParagraphFont"/>
-    <w:link w:val="Heading4"/>
+  <w:style w:type="character" w:customStyle="1" w:styleId="Kop4Char">
+    <w:name w:val="Kop 4 Char"/>
+    <w:basedOn w:val="Standaardalinea-lettertype"/>
+    <w:link w:val="Kop4"/>
     <w:uiPriority w:val="9"/>
     <w:semiHidden/>
     <w:rsid w:val="006C6B48"/>
@@ -7519,10 +7520,10 @@
       <w:color w:val="0F4761" w:themeColor="accent1" w:themeShade="BF"/>
     </w:rPr>
   </w:style>
-  <w:style w:type="character" w:customStyle="1" w:styleId="Heading5Char">
-    <w:name w:val="Heading 5 Char"/>
-    <w:basedOn w:val="DefaultParagraphFont"/>
-    <w:link w:val="Heading5"/>
+  <w:style w:type="character" w:customStyle="1" w:styleId="Kop5Char">
+    <w:name w:val="Kop 5 Char"/>
+    <w:basedOn w:val="Standaardalinea-lettertype"/>
+    <w:link w:val="Kop5"/>
     <w:uiPriority w:val="9"/>
     <w:semiHidden/>
     <w:rsid w:val="006C6B48"/>
@@ -7531,10 +7532,10 @@
       <w:color w:val="0F4761" w:themeColor="accent1" w:themeShade="BF"/>
     </w:rPr>
   </w:style>
-  <w:style w:type="character" w:customStyle="1" w:styleId="Heading6Char">
-    <w:name w:val="Heading 6 Char"/>
-    <w:basedOn w:val="DefaultParagraphFont"/>
-    <w:link w:val="Heading6"/>
+  <w:style w:type="character" w:customStyle="1" w:styleId="Kop6Char">
+    <w:name w:val="Kop 6 Char"/>
+    <w:basedOn w:val="Standaardalinea-lettertype"/>
+    <w:link w:val="Kop6"/>
     <w:uiPriority w:val="9"/>
     <w:semiHidden/>
     <w:rsid w:val="006C6B48"/>
@@ -7545,10 +7546,10 @@
       <w:color w:val="595959" w:themeColor="text1" w:themeTint="A6"/>
     </w:rPr>
   </w:style>
-  <w:style w:type="character" w:customStyle="1" w:styleId="Heading7Char">
-    <w:name w:val="Heading 7 Char"/>
-    <w:basedOn w:val="DefaultParagraphFont"/>
-    <w:link w:val="Heading7"/>
+  <w:style w:type="character" w:customStyle="1" w:styleId="Kop7Char">
+    <w:name w:val="Kop 7 Char"/>
+    <w:basedOn w:val="Standaardalinea-lettertype"/>
+    <w:link w:val="Kop7"/>
     <w:uiPriority w:val="9"/>
     <w:semiHidden/>
     <w:rsid w:val="006C6B48"/>
@@ -7557,10 +7558,10 @@
       <w:color w:val="595959" w:themeColor="text1" w:themeTint="A6"/>
     </w:rPr>
   </w:style>
-  <w:style w:type="character" w:customStyle="1" w:styleId="Heading8Char">
-    <w:name w:val="Heading 8 Char"/>
-    <w:basedOn w:val="DefaultParagraphFont"/>
-    <w:link w:val="Heading8"/>
+  <w:style w:type="character" w:customStyle="1" w:styleId="Kop8Char">
+    <w:name w:val="Kop 8 Char"/>
+    <w:basedOn w:val="Standaardalinea-lettertype"/>
+    <w:link w:val="Kop8"/>
     <w:uiPriority w:val="9"/>
     <w:semiHidden/>
     <w:rsid w:val="006C6B48"/>
@@ -7571,10 +7572,10 @@
       <w:color w:val="272727" w:themeColor="text1" w:themeTint="D8"/>
     </w:rPr>
   </w:style>
-  <w:style w:type="character" w:customStyle="1" w:styleId="Heading9Char">
-    <w:name w:val="Heading 9 Char"/>
-    <w:basedOn w:val="DefaultParagraphFont"/>
-    <w:link w:val="Heading9"/>
+  <w:style w:type="character" w:customStyle="1" w:styleId="Kop9Char">
+    <w:name w:val="Kop 9 Char"/>
+    <w:basedOn w:val="Standaardalinea-lettertype"/>
+    <w:link w:val="Kop9"/>
     <w:uiPriority w:val="9"/>
     <w:semiHidden/>
     <w:rsid w:val="006C6B48"/>
@@ -7583,11 +7584,11 @@
       <w:color w:val="272727" w:themeColor="text1" w:themeTint="D8"/>
     </w:rPr>
   </w:style>
-  <w:style w:type="paragraph" w:styleId="Title">
+  <w:style w:type="paragraph" w:styleId="Titel">
     <w:name w:val="Title"/>
-    <w:basedOn w:val="Normal"/>
-    <w:next w:val="Normal"/>
-    <w:link w:val="TitleChar"/>
+    <w:basedOn w:val="Standaard"/>
+    <w:next w:val="Standaard"/>
+    <w:link w:val="TitelChar"/>
     <w:uiPriority w:val="10"/>
     <w:qFormat/>
     <w:rsid w:val="006C6B48"/>
@@ -7603,10 +7604,10 @@
       <w:szCs w:val="56"/>
     </w:rPr>
   </w:style>
-  <w:style w:type="character" w:customStyle="1" w:styleId="TitleChar">
-    <w:name w:val="Title Char"/>
-    <w:basedOn w:val="DefaultParagraphFont"/>
-    <w:link w:val="Title"/>
+  <w:style w:type="character" w:customStyle="1" w:styleId="TitelChar">
+    <w:name w:val="Titel Char"/>
+    <w:basedOn w:val="Standaardalinea-lettertype"/>
+    <w:link w:val="Titel"/>
     <w:uiPriority w:val="10"/>
     <w:rsid w:val="006C6B48"/>
     <w:rPr>
@@ -7617,11 +7618,11 @@
       <w:szCs w:val="56"/>
     </w:rPr>
   </w:style>
-  <w:style w:type="paragraph" w:styleId="Subtitle">
+  <w:style w:type="paragraph" w:styleId="Ondertitel">
     <w:name w:val="Subtitle"/>
-    <w:basedOn w:val="Normal"/>
-    <w:next w:val="Normal"/>
-    <w:link w:val="SubtitleChar"/>
+    <w:basedOn w:val="Standaard"/>
+    <w:next w:val="Standaard"/>
+    <w:link w:val="OndertitelChar"/>
     <w:uiPriority w:val="11"/>
     <w:qFormat/>
     <w:rsid w:val="006C6B48"/>
@@ -7638,10 +7639,10 @@
       <w:szCs w:val="28"/>
     </w:rPr>
   </w:style>
-  <w:style w:type="character" w:customStyle="1" w:styleId="SubtitleChar">
-    <w:name w:val="Subtitle Char"/>
-    <w:basedOn w:val="DefaultParagraphFont"/>
-    <w:link w:val="Subtitle"/>
+  <w:style w:type="character" w:customStyle="1" w:styleId="OndertitelChar">
+    <w:name w:val="Ondertitel Char"/>
+    <w:basedOn w:val="Standaardalinea-lettertype"/>
+    <w:link w:val="Ondertitel"/>
     <w:uiPriority w:val="11"/>
     <w:rsid w:val="006C6B48"/>
     <w:rPr>
@@ -7652,11 +7653,11 @@
       <w:szCs w:val="28"/>
     </w:rPr>
   </w:style>
-  <w:style w:type="paragraph" w:styleId="Quote">
+  <w:style w:type="paragraph" w:styleId="Citaat">
     <w:name w:val="Quote"/>
-    <w:basedOn w:val="Normal"/>
-    <w:next w:val="Normal"/>
-    <w:link w:val="QuoteChar"/>
+    <w:basedOn w:val="Standaard"/>
+    <w:next w:val="Standaard"/>
+    <w:link w:val="CitaatChar"/>
     <w:uiPriority w:val="29"/>
     <w:qFormat/>
     <w:rsid w:val="006C6B48"/>
@@ -7670,10 +7671,10 @@
       <w:color w:val="404040" w:themeColor="text1" w:themeTint="BF"/>
     </w:rPr>
   </w:style>
-  <w:style w:type="character" w:customStyle="1" w:styleId="QuoteChar">
-    <w:name w:val="Quote Char"/>
-    <w:basedOn w:val="DefaultParagraphFont"/>
-    <w:link w:val="Quote"/>
+  <w:style w:type="character" w:customStyle="1" w:styleId="CitaatChar">
+    <w:name w:val="Citaat Char"/>
+    <w:basedOn w:val="Standaardalinea-lettertype"/>
+    <w:link w:val="Citaat"/>
     <w:uiPriority w:val="29"/>
     <w:rsid w:val="006C6B48"/>
     <w:rPr>
@@ -7682,9 +7683,9 @@
       <w:color w:val="404040" w:themeColor="text1" w:themeTint="BF"/>
     </w:rPr>
   </w:style>
-  <w:style w:type="paragraph" w:styleId="ListParagraph">
+  <w:style w:type="paragraph" w:styleId="Lijstalinea">
     <w:name w:val="List Paragraph"/>
-    <w:basedOn w:val="Normal"/>
+    <w:basedOn w:val="Standaard"/>
     <w:uiPriority w:val="34"/>
     <w:qFormat/>
     <w:rsid w:val="006C6B48"/>
@@ -7693,9 +7694,9 @@
       <w:contextualSpacing/>
     </w:pPr>
   </w:style>
-  <w:style w:type="character" w:styleId="IntenseEmphasis">
+  <w:style w:type="character" w:styleId="Intensievebenadrukking">
     <w:name w:val="Intense Emphasis"/>
-    <w:basedOn w:val="DefaultParagraphFont"/>
+    <w:basedOn w:val="Standaardalinea-lettertype"/>
     <w:uiPriority w:val="21"/>
     <w:qFormat/>
     <w:rsid w:val="006C6B48"/>
@@ -7705,11 +7706,11 @@
       <w:color w:val="0F4761" w:themeColor="accent1" w:themeShade="BF"/>
     </w:rPr>
   </w:style>
-  <w:style w:type="paragraph" w:styleId="IntenseQuote">
+  <w:style w:type="paragraph" w:styleId="Duidelijkcitaat">
     <w:name w:val="Intense Quote"/>
-    <w:basedOn w:val="Normal"/>
-    <w:next w:val="Normal"/>
-    <w:link w:val="IntenseQuoteChar"/>
+    <w:basedOn w:val="Standaard"/>
+    <w:next w:val="Standaard"/>
+    <w:link w:val="DuidelijkcitaatChar"/>
     <w:uiPriority w:val="30"/>
     <w:qFormat/>
     <w:rsid w:val="006C6B48"/>
@@ -7728,10 +7729,10 @@
       <w:color w:val="0F4761" w:themeColor="accent1" w:themeShade="BF"/>
     </w:rPr>
   </w:style>
-  <w:style w:type="character" w:customStyle="1" w:styleId="IntenseQuoteChar">
-    <w:name w:val="Intense Quote Char"/>
-    <w:basedOn w:val="DefaultParagraphFont"/>
-    <w:link w:val="IntenseQuote"/>
+  <w:style w:type="character" w:customStyle="1" w:styleId="DuidelijkcitaatChar">
+    <w:name w:val="Duidelijk citaat Char"/>
+    <w:basedOn w:val="Standaardalinea-lettertype"/>
+    <w:link w:val="Duidelijkcitaat"/>
     <w:uiPriority w:val="30"/>
     <w:rsid w:val="006C6B48"/>
     <w:rPr>
@@ -7740,9 +7741,9 @@
       <w:color w:val="0F4761" w:themeColor="accent1" w:themeShade="BF"/>
     </w:rPr>
   </w:style>
-  <w:style w:type="character" w:styleId="IntenseReference">
+  <w:style w:type="character" w:styleId="Intensieveverwijzing">
     <w:name w:val="Intense Reference"/>
-    <w:basedOn w:val="DefaultParagraphFont"/>
+    <w:basedOn w:val="Standaardalinea-lettertype"/>
     <w:uiPriority w:val="32"/>
     <w:qFormat/>
     <w:rsid w:val="006C6B48"/>
@@ -7756,7 +7757,7 @@
   </w:style>
   <w:style w:type="character" w:styleId="Hyperlink">
     <w:name w:val="Hyperlink"/>
-    <w:basedOn w:val="DefaultParagraphFont"/>
+    <w:basedOn w:val="Standaardalinea-lettertype"/>
     <w:uiPriority w:val="99"/>
     <w:unhideWhenUsed/>
     <w:rsid w:val="00B17B16"/>
@@ -7765,9 +7766,9 @@
       <w:u w:val="single"/>
     </w:rPr>
   </w:style>
-  <w:style w:type="character" w:styleId="UnresolvedMention">
+  <w:style w:type="character" w:styleId="Onopgelostemelding">
     <w:name w:val="Unresolved Mention"/>
-    <w:basedOn w:val="DefaultParagraphFont"/>
+    <w:basedOn w:val="Standaardalinea-lettertype"/>
     <w:uiPriority w:val="99"/>
     <w:semiHidden/>
     <w:unhideWhenUsed/>
@@ -7777,9 +7778,9 @@
       <w:shd w:val="clear" w:color="auto" w:fill="E1DFDD"/>
     </w:rPr>
   </w:style>
-  <w:style w:type="character" w:styleId="FollowedHyperlink">
+  <w:style w:type="character" w:styleId="GevolgdeHyperlink">
     <w:name w:val="FollowedHyperlink"/>
-    <w:basedOn w:val="DefaultParagraphFont"/>
+    <w:basedOn w:val="Standaardalinea-lettertype"/>
     <w:uiPriority w:val="99"/>
     <w:semiHidden/>
     <w:unhideWhenUsed/>
@@ -7791,7 +7792,7 @@
   </w:style>
   <w:style w:type="paragraph" w:customStyle="1" w:styleId="p1">
     <w:name w:val="p1"/>
-    <w:basedOn w:val="Normal"/>
+    <w:basedOn w:val="Standaard"/>
     <w:rsid w:val="00CD5760"/>
     <w:pPr>
       <w:spacing w:before="100" w:beforeAutospacing="1" w:after="100" w:afterAutospacing="1" w:line="240" w:lineRule="auto"/>
@@ -7802,10 +7803,10 @@
       <w14:ligatures w14:val="none"/>
     </w:rPr>
   </w:style>
-  <w:style w:type="paragraph" w:styleId="Header">
+  <w:style w:type="paragraph" w:styleId="Koptekst">
     <w:name w:val="header"/>
-    <w:basedOn w:val="Normal"/>
-    <w:link w:val="HeaderChar"/>
+    <w:basedOn w:val="Standaard"/>
+    <w:link w:val="KoptekstChar"/>
     <w:uiPriority w:val="99"/>
     <w:unhideWhenUsed/>
     <w:rsid w:val="00E42CC0"/>
@@ -7817,17 +7818,17 @@
       <w:spacing w:after="0" w:line="240" w:lineRule="auto"/>
     </w:pPr>
   </w:style>
-  <w:style w:type="character" w:customStyle="1" w:styleId="HeaderChar">
-    <w:name w:val="Header Char"/>
-    <w:basedOn w:val="DefaultParagraphFont"/>
-    <w:link w:val="Header"/>
+  <w:style w:type="character" w:customStyle="1" w:styleId="KoptekstChar">
+    <w:name w:val="Koptekst Char"/>
+    <w:basedOn w:val="Standaardalinea-lettertype"/>
+    <w:link w:val="Koptekst"/>
     <w:uiPriority w:val="99"/>
     <w:rsid w:val="00E42CC0"/>
   </w:style>
-  <w:style w:type="paragraph" w:styleId="Footer">
+  <w:style w:type="paragraph" w:styleId="Voettekst">
     <w:name w:val="footer"/>
-    <w:basedOn w:val="Normal"/>
-    <w:link w:val="FooterChar"/>
+    <w:basedOn w:val="Standaard"/>
+    <w:link w:val="VoettekstChar"/>
     <w:uiPriority w:val="99"/>
     <w:unhideWhenUsed/>
     <w:rsid w:val="00E42CC0"/>
@@ -7839,16 +7840,16 @@
       <w:spacing w:after="0" w:line="240" w:lineRule="auto"/>
     </w:pPr>
   </w:style>
-  <w:style w:type="character" w:customStyle="1" w:styleId="FooterChar">
-    <w:name w:val="Footer Char"/>
-    <w:basedOn w:val="DefaultParagraphFont"/>
-    <w:link w:val="Footer"/>
+  <w:style w:type="character" w:customStyle="1" w:styleId="VoettekstChar">
+    <w:name w:val="Voettekst Char"/>
+    <w:basedOn w:val="Standaardalinea-lettertype"/>
+    <w:link w:val="Voettekst"/>
     <w:uiPriority w:val="99"/>
     <w:rsid w:val="00E42CC0"/>
   </w:style>
-  <w:style w:type="table" w:styleId="TableGrid">
+  <w:style w:type="table" w:styleId="Tabelraster">
     <w:name w:val="Table Grid"/>
-    <w:basedOn w:val="TableNormal"/>
+    <w:basedOn w:val="Standaardtabel"/>
     <w:uiPriority w:val="39"/>
     <w:rsid w:val="00D503A8"/>
     <w:pPr>
@@ -7865,10 +7866,10 @@
       </w:tblBorders>
     </w:tblPr>
   </w:style>
-  <w:style w:type="paragraph" w:styleId="TOCHeading">
+  <w:style w:type="paragraph" w:styleId="Kopvaninhoudsopgave">
     <w:name w:val="TOC Heading"/>
-    <w:basedOn w:val="Heading1"/>
-    <w:next w:val="Normal"/>
+    <w:basedOn w:val="Kop1"/>
+    <w:next w:val="Standaard"/>
     <w:uiPriority w:val="39"/>
     <w:unhideWhenUsed/>
     <w:qFormat/>
@@ -7886,10 +7887,10 @@
       <w14:ligatures w14:val="none"/>
     </w:rPr>
   </w:style>
-  <w:style w:type="paragraph" w:styleId="TOC1">
+  <w:style w:type="paragraph" w:styleId="Inhopg1">
     <w:name w:val="toc 1"/>
-    <w:basedOn w:val="Normal"/>
-    <w:next w:val="Normal"/>
+    <w:basedOn w:val="Standaard"/>
+    <w:next w:val="Standaard"/>
     <w:autoRedefine/>
     <w:uiPriority w:val="39"/>
     <w:unhideWhenUsed/>
@@ -7904,10 +7905,10 @@
       <w:iCs/>
     </w:rPr>
   </w:style>
-  <w:style w:type="paragraph" w:styleId="TOC2">
+  <w:style w:type="paragraph" w:styleId="Inhopg2">
     <w:name w:val="toc 2"/>
-    <w:basedOn w:val="Normal"/>
-    <w:next w:val="Normal"/>
+    <w:basedOn w:val="Standaard"/>
+    <w:next w:val="Standaard"/>
     <w:autoRedefine/>
     <w:uiPriority w:val="39"/>
     <w:unhideWhenUsed/>
@@ -7923,10 +7924,10 @@
       <w:szCs w:val="22"/>
     </w:rPr>
   </w:style>
-  <w:style w:type="paragraph" w:styleId="TOC3">
+  <w:style w:type="paragraph" w:styleId="Inhopg3">
     <w:name w:val="toc 3"/>
-    <w:basedOn w:val="Normal"/>
-    <w:next w:val="Normal"/>
+    <w:basedOn w:val="Standaard"/>
+    <w:next w:val="Standaard"/>
     <w:autoRedefine/>
     <w:uiPriority w:val="39"/>
     <w:semiHidden/>
@@ -7941,10 +7942,10 @@
       <w:szCs w:val="20"/>
     </w:rPr>
   </w:style>
-  <w:style w:type="paragraph" w:styleId="TOC4">
+  <w:style w:type="paragraph" w:styleId="Inhopg4">
     <w:name w:val="toc 4"/>
-    <w:basedOn w:val="Normal"/>
-    <w:next w:val="Normal"/>
+    <w:basedOn w:val="Standaard"/>
+    <w:next w:val="Standaard"/>
     <w:autoRedefine/>
     <w:uiPriority w:val="39"/>
     <w:semiHidden/>
@@ -7959,10 +7960,10 @@
       <w:szCs w:val="20"/>
     </w:rPr>
   </w:style>
-  <w:style w:type="paragraph" w:styleId="TOC5">
+  <w:style w:type="paragraph" w:styleId="Inhopg5">
     <w:name w:val="toc 5"/>
-    <w:basedOn w:val="Normal"/>
-    <w:next w:val="Normal"/>
+    <w:basedOn w:val="Standaard"/>
+    <w:next w:val="Standaard"/>
     <w:autoRedefine/>
     <w:uiPriority w:val="39"/>
     <w:semiHidden/>
@@ -7977,10 +7978,10 @@
       <w:szCs w:val="20"/>
     </w:rPr>
   </w:style>
-  <w:style w:type="paragraph" w:styleId="TOC6">
+  <w:style w:type="paragraph" w:styleId="Inhopg6">
     <w:name w:val="toc 6"/>
-    <w:basedOn w:val="Normal"/>
-    <w:next w:val="Normal"/>
+    <w:basedOn w:val="Standaard"/>
+    <w:next w:val="Standaard"/>
     <w:autoRedefine/>
     <w:uiPriority w:val="39"/>
     <w:semiHidden/>
@@ -7995,10 +7996,10 @@
       <w:szCs w:val="20"/>
     </w:rPr>
   </w:style>
-  <w:style w:type="paragraph" w:styleId="TOC7">
+  <w:style w:type="paragraph" w:styleId="Inhopg7">
     <w:name w:val="toc 7"/>
-    <w:basedOn w:val="Normal"/>
-    <w:next w:val="Normal"/>
+    <w:basedOn w:val="Standaard"/>
+    <w:next w:val="Standaard"/>
     <w:autoRedefine/>
     <w:uiPriority w:val="39"/>
     <w:semiHidden/>
@@ -8013,10 +8014,10 @@
       <w:szCs w:val="20"/>
     </w:rPr>
   </w:style>
-  <w:style w:type="paragraph" w:styleId="TOC8">
+  <w:style w:type="paragraph" w:styleId="Inhopg8">
     <w:name w:val="toc 8"/>
-    <w:basedOn w:val="Normal"/>
-    <w:next w:val="Normal"/>
+    <w:basedOn w:val="Standaard"/>
+    <w:next w:val="Standaard"/>
     <w:autoRedefine/>
     <w:uiPriority w:val="39"/>
     <w:semiHidden/>
@@ -8031,10 +8032,10 @@
       <w:szCs w:val="20"/>
     </w:rPr>
   </w:style>
-  <w:style w:type="paragraph" w:styleId="TOC9">
+  <w:style w:type="paragraph" w:styleId="Inhopg9">
     <w:name w:val="toc 9"/>
-    <w:basedOn w:val="Normal"/>
-    <w:next w:val="Normal"/>
+    <w:basedOn w:val="Standaard"/>
+    <w:next w:val="Standaard"/>
     <w:autoRedefine/>
     <w:uiPriority w:val="39"/>
     <w:semiHidden/>
@@ -8049,9 +8050,9 @@
       <w:szCs w:val="20"/>
     </w:rPr>
   </w:style>
-  <w:style w:type="character" w:styleId="PageNumber">
+  <w:style w:type="character" w:styleId="Paginanummer">
     <w:name w:val="page number"/>
-    <w:basedOn w:val="DefaultParagraphFont"/>
+    <w:basedOn w:val="Standaardalinea-lettertype"/>
     <w:uiPriority w:val="99"/>
     <w:semiHidden/>
     <w:unhideWhenUsed/>

</xml_diff>